<commit_message>
Pack 18.3.2 FINAL: passport code on underlined line (sz=20, pos=2) + correct codes (21=RUS, 10=foreign)
</commit_message>
<xml_diff>
--- a/templates/docx/npd_certificate_template.docx
+++ b/templates/docx/npd_certificate_template.docx
@@ -851,14 +851,14 @@
         <w:rPr>
           <w:sz w:val="24"/>
         </w:rPr>
-        <w:t xml:space="preserve">Код вида документа, удостоверяющего личность: {{ certificate.passport_code }}</w:t>
+        <w:t xml:space="preserve">Код вида документа, удостоверяющего личность: </w:t>
       </w:r>
       <w:r>
         <w:rPr>
           <w:sz w:val="24"/>
           <w:vertAlign w:val="superscript"/>
         </w:rPr>
-        <w:t/>
+        <w:t>1</w:t>
       </w:r>
       <w:r>
         <w:rPr>
@@ -872,7 +872,7 @@
           <w:position w:val="2"/>
           <w:sz w:val="20"/>
         </w:rPr>
-        <w:t/>
+        <w:t>{{ certificate.passport_code }}</w:t>
       </w:r>
     </w:p>
     <w:p>

</xml_diff>